<commit_message>
Fixed typo in section 2.4.3
</commit_message>
<xml_diff>
--- a/ci_table.docx
+++ b/ci_table.docx
@@ -49,7 +49,6 @@
           </w:tcPr>
           <w:p>
             <w:pPr>
-              <w:pStyle w:val="Normal"/>
               <w:jc w:val="left"/>
               <w:pBdr>
                 <w:bottom w:val="none" w:sz="0" w:space="0" w:color="000000"/>
@@ -59,13 +58,24 @@
               </w:pBdr>
               <w:spacing w:after="100" w:before="100" w:line="240"/>
               <w:ind w:left="100" w:right="100" w:firstLine="0" w:firstLineChars="0"/>
-            </w:pPr>
-            <w:r>
-              <w:rPr>
-                <w:rFonts w:ascii="Arial" w:hAnsi="Arial" w:eastAsia="Arial" w:cs="Arial"/>
-                <w:i w:val="false"/>
-                <w:b w:val="false"/>
-                <w:u w:val="none"/>
+              <w:rPr>
+                <w:rFonts w:ascii="Arial" w:hAnsi="Arial" w:eastAsia="Arial" w:cs="Arial"/>
+                <w:i w:val="false"/>
+                <w:b w:val="false"/>
+                <w:u w:val="none"/>
+                <w:strike w:val="false"/>
+                <w:sz w:val="22"/>
+                <w:szCs w:val="22"/>
+                <w:color w:val="000000"/>
+              </w:rPr>
+            </w:pPr>
+            <w:r>
+              <w:rPr>
+                <w:rFonts w:ascii="Arial" w:hAnsi="Arial" w:eastAsia="Arial" w:cs="Arial"/>
+                <w:i w:val="false"/>
+                <w:b w:val="false"/>
+                <w:u w:val="none"/>
+                <w:strike w:val="false"/>
                 <w:sz w:val="22"/>
                 <w:szCs w:val="22"/>
                 <w:color w:val="000000"/>
@@ -93,7 +103,6 @@
           </w:tcPr>
           <w:p>
             <w:pPr>
-              <w:pStyle w:val="Normal"/>
               <w:jc w:val="right"/>
               <w:pBdr>
                 <w:bottom w:val="none" w:sz="0" w:space="0" w:color="000000"/>
@@ -103,13 +112,24 @@
               </w:pBdr>
               <w:spacing w:after="100" w:before="100" w:line="240"/>
               <w:ind w:left="100" w:right="100" w:firstLine="0" w:firstLineChars="0"/>
-            </w:pPr>
-            <w:r>
-              <w:rPr>
-                <w:rFonts w:ascii="Arial" w:hAnsi="Arial" w:eastAsia="Arial" w:cs="Arial"/>
-                <w:i w:val="false"/>
-                <w:b w:val="false"/>
-                <w:u w:val="none"/>
+              <w:rPr>
+                <w:rFonts w:ascii="Arial" w:hAnsi="Arial" w:eastAsia="Arial" w:cs="Arial"/>
+                <w:i w:val="false"/>
+                <w:b w:val="false"/>
+                <w:u w:val="none"/>
+                <w:strike w:val="false"/>
+                <w:sz w:val="22"/>
+                <w:szCs w:val="22"/>
+                <w:color w:val="000000"/>
+              </w:rPr>
+            </w:pPr>
+            <w:r>
+              <w:rPr>
+                <w:rFonts w:ascii="Arial" w:hAnsi="Arial" w:eastAsia="Arial" w:cs="Arial"/>
+                <w:i w:val="false"/>
+                <w:b w:val="false"/>
+                <w:u w:val="none"/>
+                <w:strike w:val="false"/>
                 <w:sz w:val="22"/>
                 <w:szCs w:val="22"/>
                 <w:color w:val="000000"/>
@@ -137,7 +157,6 @@
           </w:tcPr>
           <w:p>
             <w:pPr>
-              <w:pStyle w:val="Normal"/>
               <w:jc w:val="right"/>
               <w:pBdr>
                 <w:bottom w:val="none" w:sz="0" w:space="0" w:color="000000"/>
@@ -147,13 +166,24 @@
               </w:pBdr>
               <w:spacing w:after="100" w:before="100" w:line="240"/>
               <w:ind w:left="100" w:right="100" w:firstLine="0" w:firstLineChars="0"/>
-            </w:pPr>
-            <w:r>
-              <w:rPr>
-                <w:rFonts w:ascii="Arial" w:hAnsi="Arial" w:eastAsia="Arial" w:cs="Arial"/>
-                <w:i w:val="false"/>
-                <w:b w:val="false"/>
-                <w:u w:val="none"/>
+              <w:rPr>
+                <w:rFonts w:ascii="Arial" w:hAnsi="Arial" w:eastAsia="Arial" w:cs="Arial"/>
+                <w:i w:val="false"/>
+                <w:b w:val="false"/>
+                <w:u w:val="none"/>
+                <w:strike w:val="false"/>
+                <w:sz w:val="22"/>
+                <w:szCs w:val="22"/>
+                <w:color w:val="000000"/>
+              </w:rPr>
+            </w:pPr>
+            <w:r>
+              <w:rPr>
+                <w:rFonts w:ascii="Arial" w:hAnsi="Arial" w:eastAsia="Arial" w:cs="Arial"/>
+                <w:i w:val="false"/>
+                <w:b w:val="false"/>
+                <w:u w:val="none"/>
+                <w:strike w:val="false"/>
                 <w:sz w:val="22"/>
                 <w:szCs w:val="22"/>
                 <w:color w:val="000000"/>
@@ -181,7 +211,6 @@
           </w:tcPr>
           <w:p>
             <w:pPr>
-              <w:pStyle w:val="Normal"/>
               <w:jc w:val="right"/>
               <w:pBdr>
                 <w:bottom w:val="none" w:sz="0" w:space="0" w:color="000000"/>
@@ -191,13 +220,24 @@
               </w:pBdr>
               <w:spacing w:after="100" w:before="100" w:line="240"/>
               <w:ind w:left="100" w:right="100" w:firstLine="0" w:firstLineChars="0"/>
-            </w:pPr>
-            <w:r>
-              <w:rPr>
-                <w:rFonts w:ascii="Arial" w:hAnsi="Arial" w:eastAsia="Arial" w:cs="Arial"/>
-                <w:i w:val="false"/>
-                <w:b w:val="false"/>
-                <w:u w:val="none"/>
+              <w:rPr>
+                <w:rFonts w:ascii="Arial" w:hAnsi="Arial" w:eastAsia="Arial" w:cs="Arial"/>
+                <w:i w:val="false"/>
+                <w:b w:val="false"/>
+                <w:u w:val="none"/>
+                <w:strike w:val="false"/>
+                <w:sz w:val="22"/>
+                <w:szCs w:val="22"/>
+                <w:color w:val="000000"/>
+              </w:rPr>
+            </w:pPr>
+            <w:r>
+              <w:rPr>
+                <w:rFonts w:ascii="Arial" w:hAnsi="Arial" w:eastAsia="Arial" w:cs="Arial"/>
+                <w:i w:val="false"/>
+                <w:b w:val="false"/>
+                <w:u w:val="none"/>
+                <w:strike w:val="false"/>
                 <w:sz w:val="22"/>
                 <w:szCs w:val="22"/>
                 <w:color w:val="000000"/>
@@ -225,7 +265,6 @@
           </w:tcPr>
           <w:p>
             <w:pPr>
-              <w:pStyle w:val="Normal"/>
               <w:jc w:val="right"/>
               <w:pBdr>
                 <w:bottom w:val="none" w:sz="0" w:space="0" w:color="000000"/>
@@ -235,13 +274,24 @@
               </w:pBdr>
               <w:spacing w:after="100" w:before="100" w:line="240"/>
               <w:ind w:left="100" w:right="100" w:firstLine="0" w:firstLineChars="0"/>
-            </w:pPr>
-            <w:r>
-              <w:rPr>
-                <w:rFonts w:ascii="Arial" w:hAnsi="Arial" w:eastAsia="Arial" w:cs="Arial"/>
-                <w:i w:val="false"/>
-                <w:b w:val="false"/>
-                <w:u w:val="none"/>
+              <w:rPr>
+                <w:rFonts w:ascii="Arial" w:hAnsi="Arial" w:eastAsia="Arial" w:cs="Arial"/>
+                <w:i w:val="false"/>
+                <w:b w:val="false"/>
+                <w:u w:val="none"/>
+                <w:strike w:val="false"/>
+                <w:sz w:val="22"/>
+                <w:szCs w:val="22"/>
+                <w:color w:val="000000"/>
+              </w:rPr>
+            </w:pPr>
+            <w:r>
+              <w:rPr>
+                <w:rFonts w:ascii="Arial" w:hAnsi="Arial" w:eastAsia="Arial" w:cs="Arial"/>
+                <w:i w:val="false"/>
+                <w:b w:val="false"/>
+                <w:u w:val="none"/>
+                <w:strike w:val="false"/>
                 <w:sz w:val="22"/>
                 <w:szCs w:val="22"/>
                 <w:color w:val="000000"/>
@@ -269,7 +319,6 @@
           </w:tcPr>
           <w:p>
             <w:pPr>
-              <w:pStyle w:val="Normal"/>
               <w:jc w:val="right"/>
               <w:pBdr>
                 <w:bottom w:val="none" w:sz="0" w:space="0" w:color="000000"/>
@@ -279,13 +328,24 @@
               </w:pBdr>
               <w:spacing w:after="100" w:before="100" w:line="240"/>
               <w:ind w:left="100" w:right="100" w:firstLine="0" w:firstLineChars="0"/>
-            </w:pPr>
-            <w:r>
-              <w:rPr>
-                <w:rFonts w:ascii="Arial" w:hAnsi="Arial" w:eastAsia="Arial" w:cs="Arial"/>
-                <w:i w:val="false"/>
-                <w:b w:val="false"/>
-                <w:u w:val="none"/>
+              <w:rPr>
+                <w:rFonts w:ascii="Arial" w:hAnsi="Arial" w:eastAsia="Arial" w:cs="Arial"/>
+                <w:i w:val="false"/>
+                <w:b w:val="false"/>
+                <w:u w:val="none"/>
+                <w:strike w:val="false"/>
+                <w:sz w:val="22"/>
+                <w:szCs w:val="22"/>
+                <w:color w:val="000000"/>
+              </w:rPr>
+            </w:pPr>
+            <w:r>
+              <w:rPr>
+                <w:rFonts w:ascii="Arial" w:hAnsi="Arial" w:eastAsia="Arial" w:cs="Arial"/>
+                <w:i w:val="false"/>
+                <w:b w:val="false"/>
+                <w:u w:val="none"/>
+                <w:strike w:val="false"/>
                 <w:sz w:val="22"/>
                 <w:szCs w:val="22"/>
                 <w:color w:val="000000"/>
@@ -319,7 +379,6 @@
           </w:tcPr>
           <w:p>
             <w:pPr>
-              <w:pStyle w:val="Normal"/>
               <w:jc w:val="left"/>
               <w:pBdr>
                 <w:bottom w:val="none" w:sz="0" w:space="0" w:color="000000"/>
@@ -329,13 +388,24 @@
               </w:pBdr>
               <w:spacing w:after="100" w:before="100" w:line="240"/>
               <w:ind w:left="100" w:right="100" w:firstLine="0" w:firstLineChars="0"/>
-            </w:pPr>
-            <w:r>
-              <w:rPr>
-                <w:rFonts w:ascii="Arial" w:hAnsi="Arial" w:eastAsia="Arial" w:cs="Arial"/>
-                <w:i w:val="false"/>
-                <w:b w:val="false"/>
-                <w:u w:val="none"/>
+              <w:rPr>
+                <w:rFonts w:ascii="Arial" w:hAnsi="Arial" w:eastAsia="Arial" w:cs="Arial"/>
+                <w:i w:val="false"/>
+                <w:b w:val="false"/>
+                <w:u w:val="none"/>
+                <w:strike w:val="false"/>
+                <w:sz w:val="22"/>
+                <w:szCs w:val="22"/>
+                <w:color w:val="000000"/>
+              </w:rPr>
+            </w:pPr>
+            <w:r>
+              <w:rPr>
+                <w:rFonts w:ascii="Arial" w:hAnsi="Arial" w:eastAsia="Arial" w:cs="Arial"/>
+                <w:i w:val="false"/>
+                <w:b w:val="false"/>
+                <w:u w:val="none"/>
+                <w:strike w:val="false"/>
                 <w:sz w:val="22"/>
                 <w:szCs w:val="22"/>
                 <w:color w:val="000000"/>
@@ -363,7 +433,6 @@
           </w:tcPr>
           <w:p>
             <w:pPr>
-              <w:pStyle w:val="Normal"/>
               <w:jc w:val="right"/>
               <w:pBdr>
                 <w:bottom w:val="none" w:sz="0" w:space="0" w:color="000000"/>
@@ -373,13 +442,24 @@
               </w:pBdr>
               <w:spacing w:after="100" w:before="100" w:line="240"/>
               <w:ind w:left="100" w:right="100" w:firstLine="0" w:firstLineChars="0"/>
-            </w:pPr>
-            <w:r>
-              <w:rPr>
-                <w:rFonts w:ascii="Arial" w:hAnsi="Arial" w:eastAsia="Arial" w:cs="Arial"/>
-                <w:i w:val="false"/>
-                <w:b w:val="false"/>
-                <w:u w:val="none"/>
+              <w:rPr>
+                <w:rFonts w:ascii="Arial" w:hAnsi="Arial" w:eastAsia="Arial" w:cs="Arial"/>
+                <w:i w:val="false"/>
+                <w:b w:val="false"/>
+                <w:u w:val="none"/>
+                <w:strike w:val="false"/>
+                <w:sz w:val="22"/>
+                <w:szCs w:val="22"/>
+                <w:color w:val="000000"/>
+              </w:rPr>
+            </w:pPr>
+            <w:r>
+              <w:rPr>
+                <w:rFonts w:ascii="Arial" w:hAnsi="Arial" w:eastAsia="Arial" w:cs="Arial"/>
+                <w:i w:val="false"/>
+                <w:b w:val="false"/>
+                <w:u w:val="none"/>
+                <w:strike w:val="false"/>
                 <w:sz w:val="22"/>
                 <w:szCs w:val="22"/>
                 <w:color w:val="000000"/>
@@ -407,7 +487,6 @@
           </w:tcPr>
           <w:p>
             <w:pPr>
-              <w:pStyle w:val="Normal"/>
               <w:jc w:val="right"/>
               <w:pBdr>
                 <w:bottom w:val="none" w:sz="0" w:space="0" w:color="000000"/>
@@ -417,13 +496,24 @@
               </w:pBdr>
               <w:spacing w:after="100" w:before="100" w:line="240"/>
               <w:ind w:left="100" w:right="100" w:firstLine="0" w:firstLineChars="0"/>
-            </w:pPr>
-            <w:r>
-              <w:rPr>
-                <w:rFonts w:ascii="Arial" w:hAnsi="Arial" w:eastAsia="Arial" w:cs="Arial"/>
-                <w:i w:val="false"/>
-                <w:b w:val="false"/>
-                <w:u w:val="none"/>
+              <w:rPr>
+                <w:rFonts w:ascii="Arial" w:hAnsi="Arial" w:eastAsia="Arial" w:cs="Arial"/>
+                <w:i w:val="false"/>
+                <w:b w:val="false"/>
+                <w:u w:val="none"/>
+                <w:strike w:val="false"/>
+                <w:sz w:val="22"/>
+                <w:szCs w:val="22"/>
+                <w:color w:val="000000"/>
+              </w:rPr>
+            </w:pPr>
+            <w:r>
+              <w:rPr>
+                <w:rFonts w:ascii="Arial" w:hAnsi="Arial" w:eastAsia="Arial" w:cs="Arial"/>
+                <w:i w:val="false"/>
+                <w:b w:val="false"/>
+                <w:u w:val="none"/>
+                <w:strike w:val="false"/>
                 <w:sz w:val="22"/>
                 <w:szCs w:val="22"/>
                 <w:color w:val="000000"/>
@@ -451,7 +541,6 @@
           </w:tcPr>
           <w:p>
             <w:pPr>
-              <w:pStyle w:val="Normal"/>
               <w:jc w:val="right"/>
               <w:pBdr>
                 <w:bottom w:val="none" w:sz="0" w:space="0" w:color="000000"/>
@@ -461,13 +550,24 @@
               </w:pBdr>
               <w:spacing w:after="100" w:before="100" w:line="240"/>
               <w:ind w:left="100" w:right="100" w:firstLine="0" w:firstLineChars="0"/>
-            </w:pPr>
-            <w:r>
-              <w:rPr>
-                <w:rFonts w:ascii="Arial" w:hAnsi="Arial" w:eastAsia="Arial" w:cs="Arial"/>
-                <w:i w:val="false"/>
-                <w:b w:val="false"/>
-                <w:u w:val="none"/>
+              <w:rPr>
+                <w:rFonts w:ascii="Arial" w:hAnsi="Arial" w:eastAsia="Arial" w:cs="Arial"/>
+                <w:i w:val="false"/>
+                <w:b w:val="false"/>
+                <w:u w:val="none"/>
+                <w:strike w:val="false"/>
+                <w:sz w:val="22"/>
+                <w:szCs w:val="22"/>
+                <w:color w:val="000000"/>
+              </w:rPr>
+            </w:pPr>
+            <w:r>
+              <w:rPr>
+                <w:rFonts w:ascii="Arial" w:hAnsi="Arial" w:eastAsia="Arial" w:cs="Arial"/>
+                <w:i w:val="false"/>
+                <w:b w:val="false"/>
+                <w:u w:val="none"/>
+                <w:strike w:val="false"/>
                 <w:sz w:val="22"/>
                 <w:szCs w:val="22"/>
                 <w:color w:val="000000"/>
@@ -495,7 +595,6 @@
           </w:tcPr>
           <w:p>
             <w:pPr>
-              <w:pStyle w:val="Normal"/>
               <w:jc w:val="right"/>
               <w:pBdr>
                 <w:bottom w:val="none" w:sz="0" w:space="0" w:color="000000"/>
@@ -505,13 +604,24 @@
               </w:pBdr>
               <w:spacing w:after="100" w:before="100" w:line="240"/>
               <w:ind w:left="100" w:right="100" w:firstLine="0" w:firstLineChars="0"/>
-            </w:pPr>
-            <w:r>
-              <w:rPr>
-                <w:rFonts w:ascii="Arial" w:hAnsi="Arial" w:eastAsia="Arial" w:cs="Arial"/>
-                <w:i w:val="false"/>
-                <w:b w:val="false"/>
-                <w:u w:val="none"/>
+              <w:rPr>
+                <w:rFonts w:ascii="Arial" w:hAnsi="Arial" w:eastAsia="Arial" w:cs="Arial"/>
+                <w:i w:val="false"/>
+                <w:b w:val="false"/>
+                <w:u w:val="none"/>
+                <w:strike w:val="false"/>
+                <w:sz w:val="22"/>
+                <w:szCs w:val="22"/>
+                <w:color w:val="000000"/>
+              </w:rPr>
+            </w:pPr>
+            <w:r>
+              <w:rPr>
+                <w:rFonts w:ascii="Arial" w:hAnsi="Arial" w:eastAsia="Arial" w:cs="Arial"/>
+                <w:i w:val="false"/>
+                <w:b w:val="false"/>
+                <w:u w:val="none"/>
+                <w:strike w:val="false"/>
                 <w:sz w:val="22"/>
                 <w:szCs w:val="22"/>
                 <w:color w:val="000000"/>
@@ -539,7 +649,6 @@
           </w:tcPr>
           <w:p>
             <w:pPr>
-              <w:pStyle w:val="Normal"/>
               <w:jc w:val="right"/>
               <w:pBdr>
                 <w:bottom w:val="none" w:sz="0" w:space="0" w:color="000000"/>
@@ -549,13 +658,24 @@
               </w:pBdr>
               <w:spacing w:after="100" w:before="100" w:line="240"/>
               <w:ind w:left="100" w:right="100" w:firstLine="0" w:firstLineChars="0"/>
-            </w:pPr>
-            <w:r>
-              <w:rPr>
-                <w:rFonts w:ascii="Arial" w:hAnsi="Arial" w:eastAsia="Arial" w:cs="Arial"/>
-                <w:i w:val="false"/>
-                <w:b w:val="false"/>
-                <w:u w:val="none"/>
+              <w:rPr>
+                <w:rFonts w:ascii="Arial" w:hAnsi="Arial" w:eastAsia="Arial" w:cs="Arial"/>
+                <w:i w:val="false"/>
+                <w:b w:val="false"/>
+                <w:u w:val="none"/>
+                <w:strike w:val="false"/>
+                <w:sz w:val="22"/>
+                <w:szCs w:val="22"/>
+                <w:color w:val="000000"/>
+              </w:rPr>
+            </w:pPr>
+            <w:r>
+              <w:rPr>
+                <w:rFonts w:ascii="Arial" w:hAnsi="Arial" w:eastAsia="Arial" w:cs="Arial"/>
+                <w:i w:val="false"/>
+                <w:b w:val="false"/>
+                <w:u w:val="none"/>
+                <w:strike w:val="false"/>
                 <w:sz w:val="22"/>
                 <w:szCs w:val="22"/>
                 <w:color w:val="000000"/>
@@ -589,7 +709,6 @@
           </w:tcPr>
           <w:p>
             <w:pPr>
-              <w:pStyle w:val="Normal"/>
               <w:jc w:val="left"/>
               <w:pBdr>
                 <w:bottom w:val="none" w:sz="0" w:space="0" w:color="000000"/>
@@ -599,13 +718,24 @@
               </w:pBdr>
               <w:spacing w:after="100" w:before="100" w:line="240"/>
               <w:ind w:left="100" w:right="100" w:firstLine="0" w:firstLineChars="0"/>
-            </w:pPr>
-            <w:r>
-              <w:rPr>
-                <w:rFonts w:ascii="Arial" w:hAnsi="Arial" w:eastAsia="Arial" w:cs="Arial"/>
-                <w:i w:val="false"/>
-                <w:b w:val="false"/>
-                <w:u w:val="none"/>
+              <w:rPr>
+                <w:rFonts w:ascii="Arial" w:hAnsi="Arial" w:eastAsia="Arial" w:cs="Arial"/>
+                <w:i w:val="false"/>
+                <w:b w:val="false"/>
+                <w:u w:val="none"/>
+                <w:strike w:val="false"/>
+                <w:sz w:val="22"/>
+                <w:szCs w:val="22"/>
+                <w:color w:val="000000"/>
+              </w:rPr>
+            </w:pPr>
+            <w:r>
+              <w:rPr>
+                <w:rFonts w:ascii="Arial" w:hAnsi="Arial" w:eastAsia="Arial" w:cs="Arial"/>
+                <w:i w:val="false"/>
+                <w:b w:val="false"/>
+                <w:u w:val="none"/>
+                <w:strike w:val="false"/>
                 <w:sz w:val="22"/>
                 <w:szCs w:val="22"/>
                 <w:color w:val="000000"/>
@@ -633,7 +763,6 @@
           </w:tcPr>
           <w:p>
             <w:pPr>
-              <w:pStyle w:val="Normal"/>
               <w:jc w:val="right"/>
               <w:pBdr>
                 <w:bottom w:val="none" w:sz="0" w:space="0" w:color="000000"/>
@@ -643,13 +772,24 @@
               </w:pBdr>
               <w:spacing w:after="100" w:before="100" w:line="240"/>
               <w:ind w:left="100" w:right="100" w:firstLine="0" w:firstLineChars="0"/>
-            </w:pPr>
-            <w:r>
-              <w:rPr>
-                <w:rFonts w:ascii="Arial" w:hAnsi="Arial" w:eastAsia="Arial" w:cs="Arial"/>
-                <w:i w:val="false"/>
-                <w:b w:val="false"/>
-                <w:u w:val="none"/>
+              <w:rPr>
+                <w:rFonts w:ascii="Arial" w:hAnsi="Arial" w:eastAsia="Arial" w:cs="Arial"/>
+                <w:i w:val="false"/>
+                <w:b w:val="false"/>
+                <w:u w:val="none"/>
+                <w:strike w:val="false"/>
+                <w:sz w:val="22"/>
+                <w:szCs w:val="22"/>
+                <w:color w:val="000000"/>
+              </w:rPr>
+            </w:pPr>
+            <w:r>
+              <w:rPr>
+                <w:rFonts w:ascii="Arial" w:hAnsi="Arial" w:eastAsia="Arial" w:cs="Arial"/>
+                <w:i w:val="false"/>
+                <w:b w:val="false"/>
+                <w:u w:val="none"/>
+                <w:strike w:val="false"/>
                 <w:sz w:val="22"/>
                 <w:szCs w:val="22"/>
                 <w:color w:val="000000"/>
@@ -677,7 +817,6 @@
           </w:tcPr>
           <w:p>
             <w:pPr>
-              <w:pStyle w:val="Normal"/>
               <w:jc w:val="right"/>
               <w:pBdr>
                 <w:bottom w:val="none" w:sz="0" w:space="0" w:color="000000"/>
@@ -687,13 +826,24 @@
               </w:pBdr>
               <w:spacing w:after="100" w:before="100" w:line="240"/>
               <w:ind w:left="100" w:right="100" w:firstLine="0" w:firstLineChars="0"/>
-            </w:pPr>
-            <w:r>
-              <w:rPr>
-                <w:rFonts w:ascii="Arial" w:hAnsi="Arial" w:eastAsia="Arial" w:cs="Arial"/>
-                <w:i w:val="false"/>
-                <w:b w:val="false"/>
-                <w:u w:val="none"/>
+              <w:rPr>
+                <w:rFonts w:ascii="Arial" w:hAnsi="Arial" w:eastAsia="Arial" w:cs="Arial"/>
+                <w:i w:val="false"/>
+                <w:b w:val="false"/>
+                <w:u w:val="none"/>
+                <w:strike w:val="false"/>
+                <w:sz w:val="22"/>
+                <w:szCs w:val="22"/>
+                <w:color w:val="000000"/>
+              </w:rPr>
+            </w:pPr>
+            <w:r>
+              <w:rPr>
+                <w:rFonts w:ascii="Arial" w:hAnsi="Arial" w:eastAsia="Arial" w:cs="Arial"/>
+                <w:i w:val="false"/>
+                <w:b w:val="false"/>
+                <w:u w:val="none"/>
+                <w:strike w:val="false"/>
                 <w:sz w:val="22"/>
                 <w:szCs w:val="22"/>
                 <w:color w:val="000000"/>
@@ -721,7 +871,6 @@
           </w:tcPr>
           <w:p>
             <w:pPr>
-              <w:pStyle w:val="Normal"/>
               <w:jc w:val="right"/>
               <w:pBdr>
                 <w:bottom w:val="none" w:sz="0" w:space="0" w:color="000000"/>
@@ -731,13 +880,24 @@
               </w:pBdr>
               <w:spacing w:after="100" w:before="100" w:line="240"/>
               <w:ind w:left="100" w:right="100" w:firstLine="0" w:firstLineChars="0"/>
-            </w:pPr>
-            <w:r>
-              <w:rPr>
-                <w:rFonts w:ascii="Arial" w:hAnsi="Arial" w:eastAsia="Arial" w:cs="Arial"/>
-                <w:i w:val="false"/>
-                <w:b w:val="false"/>
-                <w:u w:val="none"/>
+              <w:rPr>
+                <w:rFonts w:ascii="Arial" w:hAnsi="Arial" w:eastAsia="Arial" w:cs="Arial"/>
+                <w:i w:val="false"/>
+                <w:b w:val="false"/>
+                <w:u w:val="none"/>
+                <w:strike w:val="false"/>
+                <w:sz w:val="22"/>
+                <w:szCs w:val="22"/>
+                <w:color w:val="000000"/>
+              </w:rPr>
+            </w:pPr>
+            <w:r>
+              <w:rPr>
+                <w:rFonts w:ascii="Arial" w:hAnsi="Arial" w:eastAsia="Arial" w:cs="Arial"/>
+                <w:i w:val="false"/>
+                <w:b w:val="false"/>
+                <w:u w:val="none"/>
+                <w:strike w:val="false"/>
                 <w:sz w:val="22"/>
                 <w:szCs w:val="22"/>
                 <w:color w:val="000000"/>
@@ -765,7 +925,6 @@
           </w:tcPr>
           <w:p>
             <w:pPr>
-              <w:pStyle w:val="Normal"/>
               <w:jc w:val="right"/>
               <w:pBdr>
                 <w:bottom w:val="none" w:sz="0" w:space="0" w:color="000000"/>
@@ -775,13 +934,24 @@
               </w:pBdr>
               <w:spacing w:after="100" w:before="100" w:line="240"/>
               <w:ind w:left="100" w:right="100" w:firstLine="0" w:firstLineChars="0"/>
-            </w:pPr>
-            <w:r>
-              <w:rPr>
-                <w:rFonts w:ascii="Arial" w:hAnsi="Arial" w:eastAsia="Arial" w:cs="Arial"/>
-                <w:i w:val="false"/>
-                <w:b w:val="false"/>
-                <w:u w:val="none"/>
+              <w:rPr>
+                <w:rFonts w:ascii="Arial" w:hAnsi="Arial" w:eastAsia="Arial" w:cs="Arial"/>
+                <w:i w:val="false"/>
+                <w:b w:val="false"/>
+                <w:u w:val="none"/>
+                <w:strike w:val="false"/>
+                <w:sz w:val="22"/>
+                <w:szCs w:val="22"/>
+                <w:color w:val="000000"/>
+              </w:rPr>
+            </w:pPr>
+            <w:r>
+              <w:rPr>
+                <w:rFonts w:ascii="Arial" w:hAnsi="Arial" w:eastAsia="Arial" w:cs="Arial"/>
+                <w:i w:val="false"/>
+                <w:b w:val="false"/>
+                <w:u w:val="none"/>
+                <w:strike w:val="false"/>
                 <w:sz w:val="22"/>
                 <w:szCs w:val="22"/>
                 <w:color w:val="000000"/>
@@ -809,7 +979,6 @@
           </w:tcPr>
           <w:p>
             <w:pPr>
-              <w:pStyle w:val="Normal"/>
               <w:jc w:val="right"/>
               <w:pBdr>
                 <w:bottom w:val="none" w:sz="0" w:space="0" w:color="000000"/>
@@ -819,13 +988,24 @@
               </w:pBdr>
               <w:spacing w:after="100" w:before="100" w:line="240"/>
               <w:ind w:left="100" w:right="100" w:firstLine="0" w:firstLineChars="0"/>
-            </w:pPr>
-            <w:r>
-              <w:rPr>
-                <w:rFonts w:ascii="Arial" w:hAnsi="Arial" w:eastAsia="Arial" w:cs="Arial"/>
-                <w:i w:val="false"/>
-                <w:b w:val="false"/>
-                <w:u w:val="none"/>
+              <w:rPr>
+                <w:rFonts w:ascii="Arial" w:hAnsi="Arial" w:eastAsia="Arial" w:cs="Arial"/>
+                <w:i w:val="false"/>
+                <w:b w:val="false"/>
+                <w:u w:val="none"/>
+                <w:strike w:val="false"/>
+                <w:sz w:val="22"/>
+                <w:szCs w:val="22"/>
+                <w:color w:val="000000"/>
+              </w:rPr>
+            </w:pPr>
+            <w:r>
+              <w:rPr>
+                <w:rFonts w:ascii="Arial" w:hAnsi="Arial" w:eastAsia="Arial" w:cs="Arial"/>
+                <w:i w:val="false"/>
+                <w:b w:val="false"/>
+                <w:u w:val="none"/>
+                <w:strike w:val="false"/>
                 <w:sz w:val="22"/>
                 <w:szCs w:val="22"/>
                 <w:color w:val="000000"/>
@@ -859,7 +1039,6 @@
           </w:tcPr>
           <w:p>
             <w:pPr>
-              <w:pStyle w:val="Normal"/>
               <w:jc w:val="left"/>
               <w:pBdr>
                 <w:bottom w:val="none" w:sz="0" w:space="0" w:color="000000"/>
@@ -869,13 +1048,24 @@
               </w:pBdr>
               <w:spacing w:after="100" w:before="100" w:line="240"/>
               <w:ind w:left="100" w:right="100" w:firstLine="0" w:firstLineChars="0"/>
-            </w:pPr>
-            <w:r>
-              <w:rPr>
-                <w:rFonts w:ascii="Arial" w:hAnsi="Arial" w:eastAsia="Arial" w:cs="Arial"/>
-                <w:i w:val="false"/>
-                <w:b w:val="false"/>
-                <w:u w:val="none"/>
+              <w:rPr>
+                <w:rFonts w:ascii="Arial" w:hAnsi="Arial" w:eastAsia="Arial" w:cs="Arial"/>
+                <w:i w:val="false"/>
+                <w:b w:val="false"/>
+                <w:u w:val="none"/>
+                <w:strike w:val="false"/>
+                <w:sz w:val="22"/>
+                <w:szCs w:val="22"/>
+                <w:color w:val="000000"/>
+              </w:rPr>
+            </w:pPr>
+            <w:r>
+              <w:rPr>
+                <w:rFonts w:ascii="Arial" w:hAnsi="Arial" w:eastAsia="Arial" w:cs="Arial"/>
+                <w:i w:val="false"/>
+                <w:b w:val="false"/>
+                <w:u w:val="none"/>
+                <w:strike w:val="false"/>
                 <w:sz w:val="22"/>
                 <w:szCs w:val="22"/>
                 <w:color w:val="000000"/>
@@ -903,7 +1093,6 @@
           </w:tcPr>
           <w:p>
             <w:pPr>
-              <w:pStyle w:val="Normal"/>
               <w:jc w:val="right"/>
               <w:pBdr>
                 <w:bottom w:val="none" w:sz="0" w:space="0" w:color="000000"/>
@@ -913,13 +1102,24 @@
               </w:pBdr>
               <w:spacing w:after="100" w:before="100" w:line="240"/>
               <w:ind w:left="100" w:right="100" w:firstLine="0" w:firstLineChars="0"/>
-            </w:pPr>
-            <w:r>
-              <w:rPr>
-                <w:rFonts w:ascii="Arial" w:hAnsi="Arial" w:eastAsia="Arial" w:cs="Arial"/>
-                <w:i w:val="false"/>
-                <w:b w:val="false"/>
-                <w:u w:val="none"/>
+              <w:rPr>
+                <w:rFonts w:ascii="Arial" w:hAnsi="Arial" w:eastAsia="Arial" w:cs="Arial"/>
+                <w:i w:val="false"/>
+                <w:b w:val="false"/>
+                <w:u w:val="none"/>
+                <w:strike w:val="false"/>
+                <w:sz w:val="22"/>
+                <w:szCs w:val="22"/>
+                <w:color w:val="000000"/>
+              </w:rPr>
+            </w:pPr>
+            <w:r>
+              <w:rPr>
+                <w:rFonts w:ascii="Arial" w:hAnsi="Arial" w:eastAsia="Arial" w:cs="Arial"/>
+                <w:i w:val="false"/>
+                <w:b w:val="false"/>
+                <w:u w:val="none"/>
+                <w:strike w:val="false"/>
                 <w:sz w:val="22"/>
                 <w:szCs w:val="22"/>
                 <w:color w:val="000000"/>
@@ -947,7 +1147,6 @@
           </w:tcPr>
           <w:p>
             <w:pPr>
-              <w:pStyle w:val="Normal"/>
               <w:jc w:val="right"/>
               <w:pBdr>
                 <w:bottom w:val="none" w:sz="0" w:space="0" w:color="000000"/>
@@ -957,13 +1156,24 @@
               </w:pBdr>
               <w:spacing w:after="100" w:before="100" w:line="240"/>
               <w:ind w:left="100" w:right="100" w:firstLine="0" w:firstLineChars="0"/>
-            </w:pPr>
-            <w:r>
-              <w:rPr>
-                <w:rFonts w:ascii="Arial" w:hAnsi="Arial" w:eastAsia="Arial" w:cs="Arial"/>
-                <w:i w:val="false"/>
-                <w:b w:val="false"/>
-                <w:u w:val="none"/>
+              <w:rPr>
+                <w:rFonts w:ascii="Arial" w:hAnsi="Arial" w:eastAsia="Arial" w:cs="Arial"/>
+                <w:i w:val="false"/>
+                <w:b w:val="false"/>
+                <w:u w:val="none"/>
+                <w:strike w:val="false"/>
+                <w:sz w:val="22"/>
+                <w:szCs w:val="22"/>
+                <w:color w:val="000000"/>
+              </w:rPr>
+            </w:pPr>
+            <w:r>
+              <w:rPr>
+                <w:rFonts w:ascii="Arial" w:hAnsi="Arial" w:eastAsia="Arial" w:cs="Arial"/>
+                <w:i w:val="false"/>
+                <w:b w:val="false"/>
+                <w:u w:val="none"/>
+                <w:strike w:val="false"/>
                 <w:sz w:val="22"/>
                 <w:szCs w:val="22"/>
                 <w:color w:val="000000"/>
@@ -991,7 +1201,6 @@
           </w:tcPr>
           <w:p>
             <w:pPr>
-              <w:pStyle w:val="Normal"/>
               <w:jc w:val="right"/>
               <w:pBdr>
                 <w:bottom w:val="none" w:sz="0" w:space="0" w:color="000000"/>
@@ -1001,13 +1210,24 @@
               </w:pBdr>
               <w:spacing w:after="100" w:before="100" w:line="240"/>
               <w:ind w:left="100" w:right="100" w:firstLine="0" w:firstLineChars="0"/>
-            </w:pPr>
-            <w:r>
-              <w:rPr>
-                <w:rFonts w:ascii="Arial" w:hAnsi="Arial" w:eastAsia="Arial" w:cs="Arial"/>
-                <w:i w:val="false"/>
-                <w:b w:val="false"/>
-                <w:u w:val="none"/>
+              <w:rPr>
+                <w:rFonts w:ascii="Arial" w:hAnsi="Arial" w:eastAsia="Arial" w:cs="Arial"/>
+                <w:i w:val="false"/>
+                <w:b w:val="false"/>
+                <w:u w:val="none"/>
+                <w:strike w:val="false"/>
+                <w:sz w:val="22"/>
+                <w:szCs w:val="22"/>
+                <w:color w:val="000000"/>
+              </w:rPr>
+            </w:pPr>
+            <w:r>
+              <w:rPr>
+                <w:rFonts w:ascii="Arial" w:hAnsi="Arial" w:eastAsia="Arial" w:cs="Arial"/>
+                <w:i w:val="false"/>
+                <w:b w:val="false"/>
+                <w:u w:val="none"/>
+                <w:strike w:val="false"/>
                 <w:sz w:val="22"/>
                 <w:szCs w:val="22"/>
                 <w:color w:val="000000"/>
@@ -1035,7 +1255,6 @@
           </w:tcPr>
           <w:p>
             <w:pPr>
-              <w:pStyle w:val="Normal"/>
               <w:jc w:val="right"/>
               <w:pBdr>
                 <w:bottom w:val="none" w:sz="0" w:space="0" w:color="000000"/>
@@ -1045,13 +1264,24 @@
               </w:pBdr>
               <w:spacing w:after="100" w:before="100" w:line="240"/>
               <w:ind w:left="100" w:right="100" w:firstLine="0" w:firstLineChars="0"/>
-            </w:pPr>
-            <w:r>
-              <w:rPr>
-                <w:rFonts w:ascii="Arial" w:hAnsi="Arial" w:eastAsia="Arial" w:cs="Arial"/>
-                <w:i w:val="false"/>
-                <w:b w:val="false"/>
-                <w:u w:val="none"/>
+              <w:rPr>
+                <w:rFonts w:ascii="Arial" w:hAnsi="Arial" w:eastAsia="Arial" w:cs="Arial"/>
+                <w:i w:val="false"/>
+                <w:b w:val="false"/>
+                <w:u w:val="none"/>
+                <w:strike w:val="false"/>
+                <w:sz w:val="22"/>
+                <w:szCs w:val="22"/>
+                <w:color w:val="000000"/>
+              </w:rPr>
+            </w:pPr>
+            <w:r>
+              <w:rPr>
+                <w:rFonts w:ascii="Arial" w:hAnsi="Arial" w:eastAsia="Arial" w:cs="Arial"/>
+                <w:i w:val="false"/>
+                <w:b w:val="false"/>
+                <w:u w:val="none"/>
+                <w:strike w:val="false"/>
                 <w:sz w:val="22"/>
                 <w:szCs w:val="22"/>
                 <w:color w:val="000000"/>
@@ -1079,7 +1309,6 @@
           </w:tcPr>
           <w:p>
             <w:pPr>
-              <w:pStyle w:val="Normal"/>
               <w:jc w:val="right"/>
               <w:pBdr>
                 <w:bottom w:val="none" w:sz="0" w:space="0" w:color="000000"/>
@@ -1089,13 +1318,24 @@
               </w:pBdr>
               <w:spacing w:after="100" w:before="100" w:line="240"/>
               <w:ind w:left="100" w:right="100" w:firstLine="0" w:firstLineChars="0"/>
-            </w:pPr>
-            <w:r>
-              <w:rPr>
-                <w:rFonts w:ascii="Arial" w:hAnsi="Arial" w:eastAsia="Arial" w:cs="Arial"/>
-                <w:i w:val="false"/>
-                <w:b w:val="false"/>
-                <w:u w:val="none"/>
+              <w:rPr>
+                <w:rFonts w:ascii="Arial" w:hAnsi="Arial" w:eastAsia="Arial" w:cs="Arial"/>
+                <w:i w:val="false"/>
+                <w:b w:val="false"/>
+                <w:u w:val="none"/>
+                <w:strike w:val="false"/>
+                <w:sz w:val="22"/>
+                <w:szCs w:val="22"/>
+                <w:color w:val="000000"/>
+              </w:rPr>
+            </w:pPr>
+            <w:r>
+              <w:rPr>
+                <w:rFonts w:ascii="Arial" w:hAnsi="Arial" w:eastAsia="Arial" w:cs="Arial"/>
+                <w:i w:val="false"/>
+                <w:b w:val="false"/>
+                <w:u w:val="none"/>
+                <w:strike w:val="false"/>
                 <w:sz w:val="22"/>
                 <w:szCs w:val="22"/>
                 <w:color w:val="000000"/>
@@ -1129,7 +1369,6 @@
           </w:tcPr>
           <w:p>
             <w:pPr>
-              <w:pStyle w:val="Normal"/>
               <w:jc w:val="left"/>
               <w:pBdr>
                 <w:bottom w:val="none" w:sz="0" w:space="0" w:color="000000"/>
@@ -1139,13 +1378,24 @@
               </w:pBdr>
               <w:spacing w:after="100" w:before="100" w:line="240"/>
               <w:ind w:left="100" w:right="100" w:firstLine="0" w:firstLineChars="0"/>
-            </w:pPr>
-            <w:r>
-              <w:rPr>
-                <w:rFonts w:ascii="Arial" w:hAnsi="Arial" w:eastAsia="Arial" w:cs="Arial"/>
-                <w:i w:val="false"/>
-                <w:b w:val="false"/>
-                <w:u w:val="none"/>
+              <w:rPr>
+                <w:rFonts w:ascii="Arial" w:hAnsi="Arial" w:eastAsia="Arial" w:cs="Arial"/>
+                <w:i w:val="false"/>
+                <w:b w:val="false"/>
+                <w:u w:val="none"/>
+                <w:strike w:val="false"/>
+                <w:sz w:val="22"/>
+                <w:szCs w:val="22"/>
+                <w:color w:val="000000"/>
+              </w:rPr>
+            </w:pPr>
+            <w:r>
+              <w:rPr>
+                <w:rFonts w:ascii="Arial" w:hAnsi="Arial" w:eastAsia="Arial" w:cs="Arial"/>
+                <w:i w:val="false"/>
+                <w:b w:val="false"/>
+                <w:u w:val="none"/>
+                <w:strike w:val="false"/>
                 <w:sz w:val="22"/>
                 <w:szCs w:val="22"/>
                 <w:color w:val="000000"/>
@@ -1173,7 +1423,6 @@
           </w:tcPr>
           <w:p>
             <w:pPr>
-              <w:pStyle w:val="Normal"/>
               <w:jc w:val="right"/>
               <w:pBdr>
                 <w:bottom w:val="none" w:sz="0" w:space="0" w:color="000000"/>
@@ -1183,13 +1432,24 @@
               </w:pBdr>
               <w:spacing w:after="100" w:before="100" w:line="240"/>
               <w:ind w:left="100" w:right="100" w:firstLine="0" w:firstLineChars="0"/>
-            </w:pPr>
-            <w:r>
-              <w:rPr>
-                <w:rFonts w:ascii="Arial" w:hAnsi="Arial" w:eastAsia="Arial" w:cs="Arial"/>
-                <w:i w:val="false"/>
-                <w:b w:val="false"/>
-                <w:u w:val="none"/>
+              <w:rPr>
+                <w:rFonts w:ascii="Arial" w:hAnsi="Arial" w:eastAsia="Arial" w:cs="Arial"/>
+                <w:i w:val="false"/>
+                <w:b w:val="false"/>
+                <w:u w:val="none"/>
+                <w:strike w:val="false"/>
+                <w:sz w:val="22"/>
+                <w:szCs w:val="22"/>
+                <w:color w:val="000000"/>
+              </w:rPr>
+            </w:pPr>
+            <w:r>
+              <w:rPr>
+                <w:rFonts w:ascii="Arial" w:hAnsi="Arial" w:eastAsia="Arial" w:cs="Arial"/>
+                <w:i w:val="false"/>
+                <w:b w:val="false"/>
+                <w:u w:val="none"/>
+                <w:strike w:val="false"/>
                 <w:sz w:val="22"/>
                 <w:szCs w:val="22"/>
                 <w:color w:val="000000"/>
@@ -1217,7 +1477,6 @@
           </w:tcPr>
           <w:p>
             <w:pPr>
-              <w:pStyle w:val="Normal"/>
               <w:jc w:val="right"/>
               <w:pBdr>
                 <w:bottom w:val="none" w:sz="0" w:space="0" w:color="000000"/>
@@ -1227,13 +1486,24 @@
               </w:pBdr>
               <w:spacing w:after="100" w:before="100" w:line="240"/>
               <w:ind w:left="100" w:right="100" w:firstLine="0" w:firstLineChars="0"/>
-            </w:pPr>
-            <w:r>
-              <w:rPr>
-                <w:rFonts w:ascii="Arial" w:hAnsi="Arial" w:eastAsia="Arial" w:cs="Arial"/>
-                <w:i w:val="false"/>
-                <w:b w:val="false"/>
-                <w:u w:val="none"/>
+              <w:rPr>
+                <w:rFonts w:ascii="Arial" w:hAnsi="Arial" w:eastAsia="Arial" w:cs="Arial"/>
+                <w:i w:val="false"/>
+                <w:b w:val="false"/>
+                <w:u w:val="none"/>
+                <w:strike w:val="false"/>
+                <w:sz w:val="22"/>
+                <w:szCs w:val="22"/>
+                <w:color w:val="000000"/>
+              </w:rPr>
+            </w:pPr>
+            <w:r>
+              <w:rPr>
+                <w:rFonts w:ascii="Arial" w:hAnsi="Arial" w:eastAsia="Arial" w:cs="Arial"/>
+                <w:i w:val="false"/>
+                <w:b w:val="false"/>
+                <w:u w:val="none"/>
+                <w:strike w:val="false"/>
                 <w:sz w:val="22"/>
                 <w:szCs w:val="22"/>
                 <w:color w:val="000000"/>
@@ -1261,7 +1531,6 @@
           </w:tcPr>
           <w:p>
             <w:pPr>
-              <w:pStyle w:val="Normal"/>
               <w:jc w:val="right"/>
               <w:pBdr>
                 <w:bottom w:val="none" w:sz="0" w:space="0" w:color="000000"/>
@@ -1271,13 +1540,24 @@
               </w:pBdr>
               <w:spacing w:after="100" w:before="100" w:line="240"/>
               <w:ind w:left="100" w:right="100" w:firstLine="0" w:firstLineChars="0"/>
-            </w:pPr>
-            <w:r>
-              <w:rPr>
-                <w:rFonts w:ascii="Arial" w:hAnsi="Arial" w:eastAsia="Arial" w:cs="Arial"/>
-                <w:i w:val="false"/>
-                <w:b w:val="false"/>
-                <w:u w:val="none"/>
+              <w:rPr>
+                <w:rFonts w:ascii="Arial" w:hAnsi="Arial" w:eastAsia="Arial" w:cs="Arial"/>
+                <w:i w:val="false"/>
+                <w:b w:val="false"/>
+                <w:u w:val="none"/>
+                <w:strike w:val="false"/>
+                <w:sz w:val="22"/>
+                <w:szCs w:val="22"/>
+                <w:color w:val="000000"/>
+              </w:rPr>
+            </w:pPr>
+            <w:r>
+              <w:rPr>
+                <w:rFonts w:ascii="Arial" w:hAnsi="Arial" w:eastAsia="Arial" w:cs="Arial"/>
+                <w:i w:val="false"/>
+                <w:b w:val="false"/>
+                <w:u w:val="none"/>
+                <w:strike w:val="false"/>
                 <w:sz w:val="22"/>
                 <w:szCs w:val="22"/>
                 <w:color w:val="000000"/>
@@ -1305,7 +1585,6 @@
           </w:tcPr>
           <w:p>
             <w:pPr>
-              <w:pStyle w:val="Normal"/>
               <w:jc w:val="right"/>
               <w:pBdr>
                 <w:bottom w:val="none" w:sz="0" w:space="0" w:color="000000"/>
@@ -1315,13 +1594,24 @@
               </w:pBdr>
               <w:spacing w:after="100" w:before="100" w:line="240"/>
               <w:ind w:left="100" w:right="100" w:firstLine="0" w:firstLineChars="0"/>
-            </w:pPr>
-            <w:r>
-              <w:rPr>
-                <w:rFonts w:ascii="Arial" w:hAnsi="Arial" w:eastAsia="Arial" w:cs="Arial"/>
-                <w:i w:val="false"/>
-                <w:b w:val="false"/>
-                <w:u w:val="none"/>
+              <w:rPr>
+                <w:rFonts w:ascii="Arial" w:hAnsi="Arial" w:eastAsia="Arial" w:cs="Arial"/>
+                <w:i w:val="false"/>
+                <w:b w:val="false"/>
+                <w:u w:val="none"/>
+                <w:strike w:val="false"/>
+                <w:sz w:val="22"/>
+                <w:szCs w:val="22"/>
+                <w:color w:val="000000"/>
+              </w:rPr>
+            </w:pPr>
+            <w:r>
+              <w:rPr>
+                <w:rFonts w:ascii="Arial" w:hAnsi="Arial" w:eastAsia="Arial" w:cs="Arial"/>
+                <w:i w:val="false"/>
+                <w:b w:val="false"/>
+                <w:u w:val="none"/>
+                <w:strike w:val="false"/>
                 <w:sz w:val="22"/>
                 <w:szCs w:val="22"/>
                 <w:color w:val="000000"/>
@@ -1349,7 +1639,6 @@
           </w:tcPr>
           <w:p>
             <w:pPr>
-              <w:pStyle w:val="Normal"/>
               <w:jc w:val="right"/>
               <w:pBdr>
                 <w:bottom w:val="none" w:sz="0" w:space="0" w:color="000000"/>
@@ -1359,13 +1648,24 @@
               </w:pBdr>
               <w:spacing w:after="100" w:before="100" w:line="240"/>
               <w:ind w:left="100" w:right="100" w:firstLine="0" w:firstLineChars="0"/>
-            </w:pPr>
-            <w:r>
-              <w:rPr>
-                <w:rFonts w:ascii="Arial" w:hAnsi="Arial" w:eastAsia="Arial" w:cs="Arial"/>
-                <w:i w:val="false"/>
-                <w:b w:val="false"/>
-                <w:u w:val="none"/>
+              <w:rPr>
+                <w:rFonts w:ascii="Arial" w:hAnsi="Arial" w:eastAsia="Arial" w:cs="Arial"/>
+                <w:i w:val="false"/>
+                <w:b w:val="false"/>
+                <w:u w:val="none"/>
+                <w:strike w:val="false"/>
+                <w:sz w:val="22"/>
+                <w:szCs w:val="22"/>
+                <w:color w:val="000000"/>
+              </w:rPr>
+            </w:pPr>
+            <w:r>
+              <w:rPr>
+                <w:rFonts w:ascii="Arial" w:hAnsi="Arial" w:eastAsia="Arial" w:cs="Arial"/>
+                <w:i w:val="false"/>
+                <w:b w:val="false"/>
+                <w:u w:val="none"/>
+                <w:strike w:val="false"/>
                 <w:sz w:val="22"/>
                 <w:szCs w:val="22"/>
                 <w:color w:val="000000"/>
@@ -1399,7 +1699,6 @@
           </w:tcPr>
           <w:p>
             <w:pPr>
-              <w:pStyle w:val="Normal"/>
               <w:jc w:val="left"/>
               <w:pBdr>
                 <w:bottom w:val="none" w:sz="0" w:space="0" w:color="000000"/>
@@ -1409,13 +1708,24 @@
               </w:pBdr>
               <w:spacing w:after="100" w:before="100" w:line="240"/>
               <w:ind w:left="100" w:right="100" w:firstLine="0" w:firstLineChars="0"/>
-            </w:pPr>
-            <w:r>
-              <w:rPr>
-                <w:rFonts w:ascii="Arial" w:hAnsi="Arial" w:eastAsia="Arial" w:cs="Arial"/>
-                <w:i w:val="false"/>
-                <w:b w:val="false"/>
-                <w:u w:val="none"/>
+              <w:rPr>
+                <w:rFonts w:ascii="Arial" w:hAnsi="Arial" w:eastAsia="Arial" w:cs="Arial"/>
+                <w:i w:val="false"/>
+                <w:b w:val="false"/>
+                <w:u w:val="none"/>
+                <w:strike w:val="false"/>
+                <w:sz w:val="22"/>
+                <w:szCs w:val="22"/>
+                <w:color w:val="000000"/>
+              </w:rPr>
+            </w:pPr>
+            <w:r>
+              <w:rPr>
+                <w:rFonts w:ascii="Arial" w:hAnsi="Arial" w:eastAsia="Arial" w:cs="Arial"/>
+                <w:i w:val="false"/>
+                <w:b w:val="false"/>
+                <w:u w:val="none"/>
+                <w:strike w:val="false"/>
                 <w:sz w:val="22"/>
                 <w:szCs w:val="22"/>
                 <w:color w:val="000000"/>
@@ -1443,7 +1753,6 @@
           </w:tcPr>
           <w:p>
             <w:pPr>
-              <w:pStyle w:val="Normal"/>
               <w:jc w:val="right"/>
               <w:pBdr>
                 <w:bottom w:val="none" w:sz="0" w:space="0" w:color="000000"/>
@@ -1453,13 +1762,24 @@
               </w:pBdr>
               <w:spacing w:after="100" w:before="100" w:line="240"/>
               <w:ind w:left="100" w:right="100" w:firstLine="0" w:firstLineChars="0"/>
-            </w:pPr>
-            <w:r>
-              <w:rPr>
-                <w:rFonts w:ascii="Arial" w:hAnsi="Arial" w:eastAsia="Arial" w:cs="Arial"/>
-                <w:i w:val="false"/>
-                <w:b w:val="false"/>
-                <w:u w:val="none"/>
+              <w:rPr>
+                <w:rFonts w:ascii="Arial" w:hAnsi="Arial" w:eastAsia="Arial" w:cs="Arial"/>
+                <w:i w:val="false"/>
+                <w:b w:val="false"/>
+                <w:u w:val="none"/>
+                <w:strike w:val="false"/>
+                <w:sz w:val="22"/>
+                <w:szCs w:val="22"/>
+                <w:color w:val="000000"/>
+              </w:rPr>
+            </w:pPr>
+            <w:r>
+              <w:rPr>
+                <w:rFonts w:ascii="Arial" w:hAnsi="Arial" w:eastAsia="Arial" w:cs="Arial"/>
+                <w:i w:val="false"/>
+                <w:b w:val="false"/>
+                <w:u w:val="none"/>
+                <w:strike w:val="false"/>
                 <w:sz w:val="22"/>
                 <w:szCs w:val="22"/>
                 <w:color w:val="000000"/>
@@ -1487,7 +1807,6 @@
           </w:tcPr>
           <w:p>
             <w:pPr>
-              <w:pStyle w:val="Normal"/>
               <w:jc w:val="right"/>
               <w:pBdr>
                 <w:bottom w:val="none" w:sz="0" w:space="0" w:color="000000"/>
@@ -1497,13 +1816,24 @@
               </w:pBdr>
               <w:spacing w:after="100" w:before="100" w:line="240"/>
               <w:ind w:left="100" w:right="100" w:firstLine="0" w:firstLineChars="0"/>
-            </w:pPr>
-            <w:r>
-              <w:rPr>
-                <w:rFonts w:ascii="Arial" w:hAnsi="Arial" w:eastAsia="Arial" w:cs="Arial"/>
-                <w:i w:val="false"/>
-                <w:b w:val="false"/>
-                <w:u w:val="none"/>
+              <w:rPr>
+                <w:rFonts w:ascii="Arial" w:hAnsi="Arial" w:eastAsia="Arial" w:cs="Arial"/>
+                <w:i w:val="false"/>
+                <w:b w:val="false"/>
+                <w:u w:val="none"/>
+                <w:strike w:val="false"/>
+                <w:sz w:val="22"/>
+                <w:szCs w:val="22"/>
+                <w:color w:val="000000"/>
+              </w:rPr>
+            </w:pPr>
+            <w:r>
+              <w:rPr>
+                <w:rFonts w:ascii="Arial" w:hAnsi="Arial" w:eastAsia="Arial" w:cs="Arial"/>
+                <w:i w:val="false"/>
+                <w:b w:val="false"/>
+                <w:u w:val="none"/>
+                <w:strike w:val="false"/>
                 <w:sz w:val="22"/>
                 <w:szCs w:val="22"/>
                 <w:color w:val="000000"/>
@@ -1531,7 +1861,6 @@
           </w:tcPr>
           <w:p>
             <w:pPr>
-              <w:pStyle w:val="Normal"/>
               <w:jc w:val="right"/>
               <w:pBdr>
                 <w:bottom w:val="none" w:sz="0" w:space="0" w:color="000000"/>
@@ -1541,13 +1870,24 @@
               </w:pBdr>
               <w:spacing w:after="100" w:before="100" w:line="240"/>
               <w:ind w:left="100" w:right="100" w:firstLine="0" w:firstLineChars="0"/>
-            </w:pPr>
-            <w:r>
-              <w:rPr>
-                <w:rFonts w:ascii="Arial" w:hAnsi="Arial" w:eastAsia="Arial" w:cs="Arial"/>
-                <w:i w:val="false"/>
-                <w:b w:val="false"/>
-                <w:u w:val="none"/>
+              <w:rPr>
+                <w:rFonts w:ascii="Arial" w:hAnsi="Arial" w:eastAsia="Arial" w:cs="Arial"/>
+                <w:i w:val="false"/>
+                <w:b w:val="false"/>
+                <w:u w:val="none"/>
+                <w:strike w:val="false"/>
+                <w:sz w:val="22"/>
+                <w:szCs w:val="22"/>
+                <w:color w:val="000000"/>
+              </w:rPr>
+            </w:pPr>
+            <w:r>
+              <w:rPr>
+                <w:rFonts w:ascii="Arial" w:hAnsi="Arial" w:eastAsia="Arial" w:cs="Arial"/>
+                <w:i w:val="false"/>
+                <w:b w:val="false"/>
+                <w:u w:val="none"/>
+                <w:strike w:val="false"/>
                 <w:sz w:val="22"/>
                 <w:szCs w:val="22"/>
                 <w:color w:val="000000"/>
@@ -1575,7 +1915,6 @@
           </w:tcPr>
           <w:p>
             <w:pPr>
-              <w:pStyle w:val="Normal"/>
               <w:jc w:val="right"/>
               <w:pBdr>
                 <w:bottom w:val="none" w:sz="0" w:space="0" w:color="000000"/>
@@ -1585,13 +1924,24 @@
               </w:pBdr>
               <w:spacing w:after="100" w:before="100" w:line="240"/>
               <w:ind w:left="100" w:right="100" w:firstLine="0" w:firstLineChars="0"/>
-            </w:pPr>
-            <w:r>
-              <w:rPr>
-                <w:rFonts w:ascii="Arial" w:hAnsi="Arial" w:eastAsia="Arial" w:cs="Arial"/>
-                <w:i w:val="false"/>
-                <w:b w:val="false"/>
-                <w:u w:val="none"/>
+              <w:rPr>
+                <w:rFonts w:ascii="Arial" w:hAnsi="Arial" w:eastAsia="Arial" w:cs="Arial"/>
+                <w:i w:val="false"/>
+                <w:b w:val="false"/>
+                <w:u w:val="none"/>
+                <w:strike w:val="false"/>
+                <w:sz w:val="22"/>
+                <w:szCs w:val="22"/>
+                <w:color w:val="000000"/>
+              </w:rPr>
+            </w:pPr>
+            <w:r>
+              <w:rPr>
+                <w:rFonts w:ascii="Arial" w:hAnsi="Arial" w:eastAsia="Arial" w:cs="Arial"/>
+                <w:i w:val="false"/>
+                <w:b w:val="false"/>
+                <w:u w:val="none"/>
+                <w:strike w:val="false"/>
                 <w:sz w:val="22"/>
                 <w:szCs w:val="22"/>
                 <w:color w:val="000000"/>
@@ -1619,7 +1969,6 @@
           </w:tcPr>
           <w:p>
             <w:pPr>
-              <w:pStyle w:val="Normal"/>
               <w:jc w:val="right"/>
               <w:pBdr>
                 <w:bottom w:val="none" w:sz="0" w:space="0" w:color="000000"/>
@@ -1629,13 +1978,24 @@
               </w:pBdr>
               <w:spacing w:after="100" w:before="100" w:line="240"/>
               <w:ind w:left="100" w:right="100" w:firstLine="0" w:firstLineChars="0"/>
-            </w:pPr>
-            <w:r>
-              <w:rPr>
-                <w:rFonts w:ascii="Arial" w:hAnsi="Arial" w:eastAsia="Arial" w:cs="Arial"/>
-                <w:i w:val="false"/>
-                <w:b w:val="false"/>
-                <w:u w:val="none"/>
+              <w:rPr>
+                <w:rFonts w:ascii="Arial" w:hAnsi="Arial" w:eastAsia="Arial" w:cs="Arial"/>
+                <w:i w:val="false"/>
+                <w:b w:val="false"/>
+                <w:u w:val="none"/>
+                <w:strike w:val="false"/>
+                <w:sz w:val="22"/>
+                <w:szCs w:val="22"/>
+                <w:color w:val="000000"/>
+              </w:rPr>
+            </w:pPr>
+            <w:r>
+              <w:rPr>
+                <w:rFonts w:ascii="Arial" w:hAnsi="Arial" w:eastAsia="Arial" w:cs="Arial"/>
+                <w:i w:val="false"/>
+                <w:b w:val="false"/>
+                <w:u w:val="none"/>
+                <w:strike w:val="false"/>
                 <w:sz w:val="22"/>
                 <w:szCs w:val="22"/>
                 <w:color w:val="000000"/>
@@ -1646,9 +2006,9 @@
         </w:tc>
       </w:tr>
     </w:tbl>
-    <w:sectPr w:officer="true">
-      <w:pgMar w:header="720" w:bottom="1440" w:top="1440" w:right="1440" w:left="1440" w:footer="720" w:gutter="720"/>
-      <w:pgSz w:h="16848" w:w="11952" w:orient="portrait"/>
+    <w:sectPr>
+      <w:pgMar w:header="708" w:bottom="1417" w:top="1417" w:right="1417" w:left="1417" w:footer="708" w:gutter="0"/>
+      <w:pgSz w:h="16838" w:w="11906" w:orient="portrait"/>
       <w:type w:val="continuous"/>
       <w:cols/>
     </w:sectPr>

</xml_diff>